<commit_message>
fix(labs): tree-scoped storage keys, AI Agent lab8 remote flow, Windows unblock; v4.0 courseware
- Namespace every local-tree localStorage key with _local so a webhook URL
  saved on a remote-tree page can never surface in a local lab (both trees
  serve on the same localhost ports and shared keys/origins).
- Rebuild labs_remote_n8n/lab8 flow on AI Agent + OpenAI Chat Model (the
  raw HTTP call returned empty replies on the hosted n8n).
- start.bat (all 18): clear the Windows Mark-of-the-Web on the lab's files
  before running, and document the ZIP Unblock step in README/LG/deck.
- lab4 website: expose module functions on window so onclick handlers work.
- v4.0 courseware: 3 topics over 2 days aligned to WSQ AER-TEM-4026-1.1,
  learner intro + WSQ LOs + GitHub download slides, fresh ElevenLabs/
  MediRefill/7-os screenshots, Retell assets removed.

Co-Authored-By: Claude Fable 5 <noreply@anthropic.com>
</commit_message>
<xml_diff>
--- a/courseware/LP-Automate-Video-and-Voice-AI-Agents-with-n8n.docx
+++ b/courseware/LP-Automate-Video-and-Voice-AI-Agents-with-n8n.docx
@@ -218,7 +218,7 @@
           <w:color w:val="1F6FEB"/>
           <w:sz w:val="24"/>
         </w:rPr>
-        <w:t>Version v3.0</w:t>
+        <w:t>Version v4.0</w:t>
       </w:r>
     </w:p>
     <w:p>
@@ -496,6 +496,64 @@
           </w:p>
         </w:tc>
       </w:tr>
+      <w:tr>
+        <w:tc>
+          <w:tcPr>
+            <w:tcW w:type="dxa" w:w="2160"/>
+          </w:tcPr>
+          <w:p>
+            <w:r/>
+            <w:r>
+              <w:rPr>
+                <w:sz w:val="19"/>
+              </w:rPr>
+              <w:t>v4.0</w:t>
+            </w:r>
+          </w:p>
+        </w:tc>
+        <w:tc>
+          <w:tcPr>
+            <w:tcW w:type="dxa" w:w="2160"/>
+          </w:tcPr>
+          <w:p>
+            <w:r/>
+            <w:r>
+              <w:rPr>
+                <w:sz w:val="19"/>
+              </w:rPr>
+              <w:t>14 July 2026</w:t>
+            </w:r>
+          </w:p>
+        </w:tc>
+        <w:tc>
+          <w:tcPr>
+            <w:tcW w:type="dxa" w:w="2160"/>
+          </w:tcPr>
+          <w:p>
+            <w:r/>
+            <w:r>
+              <w:rPr>
+                <w:sz w:val="19"/>
+              </w:rPr>
+              <w:t>Rebuilt as three topics over two days, aligned to the WSQ skill Artificial Intelligence Application (AER-TEM-4026-1.1): Topic 1 Chatbot (Labs 0-3), Topic 2 Voice Agent (Labs 4-5, ElevenLabs + Vapi), Topic 3 Video Agent (Labs 6-10). Added learner introductions, WSQ learning outcomes and the GitHub lab download page; matched the v4.0 WA/CS assessment set.</w:t>
+            </w:r>
+          </w:p>
+        </w:tc>
+        <w:tc>
+          <w:tcPr>
+            <w:tcW w:type="dxa" w:w="2160"/>
+          </w:tcPr>
+          <w:p>
+            <w:r/>
+            <w:r>
+              <w:rPr>
+                <w:sz w:val="19"/>
+              </w:rPr>
+              <w:t>Dr Alfred Ang</w:t>
+            </w:r>
+          </w:p>
+        </w:tc>
+      </w:tr>
     </w:tbl>
     <w:p>
       <w:r>
@@ -636,60 +694,6 @@
           <w:tab w:pos="9072" w:val="right" w:leader="dot"/>
         </w:tabs>
         <w:spacing w:after="40"/>
-        <w:ind w:left="720"/>
-      </w:pPr>
-      <w:r>
-        <w:rPr>
-          <w:b w:val="0"/>
-          <w:sz w:val="20"/>
-        </w:rPr>
-        <w:t>Day 3</w:t>
-        <w:tab/>
-        <w:t>8</w:t>
-      </w:r>
-    </w:p>
-    <w:p>
-      <w:pPr>
-        <w:tabs>
-          <w:tab w:pos="9072" w:val="right" w:leader="dot"/>
-        </w:tabs>
-        <w:spacing w:after="40"/>
-        <w:ind w:left="720"/>
-      </w:pPr>
-      <w:r>
-        <w:rPr>
-          <w:b w:val="0"/>
-          <w:sz w:val="20"/>
-        </w:rPr>
-        <w:t>Day 4</w:t>
-        <w:tab/>
-        <w:t>10</w:t>
-      </w:r>
-    </w:p>
-    <w:p>
-      <w:pPr>
-        <w:tabs>
-          <w:tab w:pos="9072" w:val="right" w:leader="dot"/>
-        </w:tabs>
-        <w:spacing w:after="40"/>
-        <w:ind w:left="720"/>
-      </w:pPr>
-      <w:r>
-        <w:rPr>
-          <w:b w:val="0"/>
-          <w:sz w:val="20"/>
-        </w:rPr>
-        <w:t>Day 5</w:t>
-        <w:tab/>
-        <w:t>11</w:t>
-      </w:r>
-    </w:p>
-    <w:p>
-      <w:pPr>
-        <w:tabs>
-          <w:tab w:pos="9072" w:val="right" w:leader="dot"/>
-        </w:tabs>
-        <w:spacing w:after="40"/>
         <w:ind w:left="360"/>
       </w:pPr>
       <w:r>
@@ -699,7 +703,7 @@
         </w:rPr>
         <w:t>Assessment</w:t>
         <w:tab/>
-        <w:t>12</w:t>
+        <w:t>8</w:t>
       </w:r>
     </w:p>
     <w:p>
@@ -717,7 +721,7 @@
         </w:rPr>
         <w:t>Evidence the trainer collects</w:t>
         <w:tab/>
-        <w:t>13</w:t>
+        <w:t>9</w:t>
       </w:r>
     </w:p>
     <w:p>
@@ -800,6 +804,28 @@
           </w:tcPr>
           <w:p>
             <w:r>
+              <w:t>WSQ skill</w:t>
+            </w:r>
+          </w:p>
+        </w:tc>
+        <w:tc>
+          <w:tcPr>
+            <w:tcW w:type="dxa" w:w="4320"/>
+          </w:tcPr>
+          <w:p>
+            <w:r>
+              <w:t>Artificial Intelligence Application (AER-TEM-4026-1.1)</w:t>
+            </w:r>
+          </w:p>
+        </w:tc>
+      </w:tr>
+      <w:tr>
+        <w:tc>
+          <w:tcPr>
+            <w:tcW w:type="dxa" w:w="4320"/>
+          </w:tcPr>
+          <w:p>
+            <w:r>
               <w:t>Version</w:t>
             </w:r>
           </w:p>
@@ -810,7 +836,7 @@
           </w:tcPr>
           <w:p>
             <w:r>
-              <w:t>v3.0 (12 July 2026)</w:t>
+              <w:t>v4.0 (14 July 2026)</w:t>
             </w:r>
           </w:p>
         </w:tc>
@@ -854,7 +880,7 @@
           </w:tcPr>
           <w:p>
             <w:r>
-              <w:t>5 training days, 8 instructional hours each</w:t>
+              <w:t>2 training days, 8 instructional hours each</w:t>
             </w:r>
           </w:p>
         </w:tc>
@@ -929,6 +955,12 @@
       </w:r>
     </w:p>
     <w:p/>
+    <w:p>
+      <w:r>
+        <w:t>Each topic delivers one WSQ learning outcome of Artificial Intelligence Application (AER-TEM-4026-1.1). The Written Assessment (SAQ) tests K1-K6; the Case Study tests A1-A6.</w:t>
+      </w:r>
+    </w:p>
+    <w:p/>
     <w:tbl>
       <w:tblPr>
         <w:tblStyle w:val="LightGrid-Accent1"/>
@@ -936,15 +968,16 @@
         <w:tblLook w:firstColumn="1" w:firstRow="1" w:lastColumn="0" w:lastRow="0" w:noHBand="0" w:noVBand="1" w:val="04A0"/>
       </w:tblPr>
       <w:tblGrid>
-        <w:gridCol w:w="2160"/>
-        <w:gridCol w:w="2160"/>
-        <w:gridCol w:w="2160"/>
-        <w:gridCol w:w="2160"/>
+        <w:gridCol w:w="1728"/>
+        <w:gridCol w:w="1728"/>
+        <w:gridCol w:w="1728"/>
+        <w:gridCol w:w="1728"/>
+        <w:gridCol w:w="1728"/>
       </w:tblGrid>
       <w:tr>
         <w:tc>
           <w:tcPr>
-            <w:tcW w:type="dxa" w:w="2160"/>
+            <w:tcW w:type="dxa" w:w="1728"/>
           </w:tcPr>
           <w:p>
             <w:r>
@@ -954,7 +987,7 @@
         </w:tc>
         <w:tc>
           <w:tcPr>
-            <w:tcW w:type="dxa" w:w="2160"/>
+            <w:tcW w:type="dxa" w:w="1728"/>
           </w:tcPr>
           <w:p>
             <w:r>
@@ -964,7 +997,7 @@
         </w:tc>
         <w:tc>
           <w:tcPr>
-            <w:tcW w:type="dxa" w:w="2160"/>
+            <w:tcW w:type="dxa" w:w="1728"/>
           </w:tcPr>
           <w:p>
             <w:r>
@@ -974,7 +1007,17 @@
         </w:tc>
         <w:tc>
           <w:tcPr>
-            <w:tcW w:type="dxa" w:w="2160"/>
+            <w:tcW w:type="dxa" w:w="1728"/>
+          </w:tcPr>
+          <w:p>
+            <w:r>
+              <w:t>WSQ outcome</w:t>
+            </w:r>
+          </w:p>
+        </w:tc>
+        <w:tc>
+          <w:tcPr>
+            <w:tcW w:type="dxa" w:w="1728"/>
           </w:tcPr>
           <w:p>
             <w:r>
@@ -986,7 +1029,7 @@
       <w:tr>
         <w:tc>
           <w:tcPr>
-            <w:tcW w:type="dxa" w:w="2160"/>
+            <w:tcW w:type="dxa" w:w="1728"/>
           </w:tcPr>
           <w:p>
             <w:r>
@@ -996,31 +1039,41 @@
         </w:tc>
         <w:tc>
           <w:tcPr>
-            <w:tcW w:type="dxa" w:w="2160"/>
+            <w:tcW w:type="dxa" w:w="1728"/>
           </w:tcPr>
           <w:p>
             <w:r>
-              <w:t>Topic 01 - Foundations of Agentic AI Loop Engineering</w:t>
+              <w:t>Topic 01 - Chatbot</w:t>
             </w:r>
           </w:p>
         </w:tc>
         <w:tc>
           <w:tcPr>
-            <w:tcW w:type="dxa" w:w="2160"/>
+            <w:tcW w:type="dxa" w:w="1728"/>
           </w:tcPr>
           <w:p>
             <w:r>
-              <w:t>Set up the local stack and learn the engineering loop used in every lab: define the task, give the agent tools, observe behavior, evaluate outputs, improve the workflow, and add guardrails.</w:t>
+              <w:t>Agents, retrieval and grounded answers: your first n8n AI agent, a RAG chatbot that admits what it does not know, and a customer-facing course advisor on a real website. Labs 0-3.</w:t>
             </w:r>
           </w:p>
         </w:tc>
         <w:tc>
           <w:tcPr>
-            <w:tcW w:type="dxa" w:w="2160"/>
+            <w:tcW w:type="dxa" w:w="1728"/>
           </w:tcPr>
           <w:p>
             <w:r>
-              <w:t>Lab 1.1, Lab 1.2, Lab 1.3</w:t>
+              <w:t>LO1 (K1, K6, A3, A5)</w:t>
+            </w:r>
+          </w:p>
+        </w:tc>
+        <w:tc>
+          <w:tcPr>
+            <w:tcW w:type="dxa" w:w="1728"/>
+          </w:tcPr>
+          <w:p>
+            <w:r>
+              <w:t>Lab 0, Lab 1, Lab 2, Lab 3</w:t>
             </w:r>
           </w:p>
         </w:tc>
@@ -1028,7 +1081,7 @@
       <w:tr>
         <w:tc>
           <w:tcPr>
-            <w:tcW w:type="dxa" w:w="2160"/>
+            <w:tcW w:type="dxa" w:w="1728"/>
           </w:tcPr>
           <w:p>
             <w:r>
@@ -1038,31 +1091,41 @@
         </w:tc>
         <w:tc>
           <w:tcPr>
-            <w:tcW w:type="dxa" w:w="2160"/>
+            <w:tcW w:type="dxa" w:w="1728"/>
           </w:tcPr>
           <w:p>
             <w:r>
-              <w:t>Topic 02 - Local AI Agents and RAG with n8n</w:t>
+              <w:t>Topic 02 - Voice Agent</w:t>
             </w:r>
           </w:p>
         </w:tc>
         <w:tc>
           <w:tcPr>
-            <w:tcW w:type="dxa" w:w="2160"/>
+            <w:tcW w:type="dxa" w:w="1728"/>
           </w:tcPr>
           <w:p>
             <w:r>
-              <w:t>Build local agents with Ollama, memory, retrieval, chunking, and document-grounded answers that can be tested and improved.</w:t>
+              <w:t>Two vendors, two architectures: ElevenLabs runs the model and calls your n8n tools; with Vapi your n8n workflow IS the model. The contrast is the lesson. Labs 4-5.</w:t>
             </w:r>
           </w:p>
         </w:tc>
         <w:tc>
           <w:tcPr>
-            <w:tcW w:type="dxa" w:w="2160"/>
+            <w:tcW w:type="dxa" w:w="1728"/>
           </w:tcPr>
           <w:p>
             <w:r>
-              <w:t>Lab 2.1, Lab 2.2, Lab 2.3, Lab 2.4</w:t>
+              <w:t>LO2 (K2, K3, A1, A4)</w:t>
+            </w:r>
+          </w:p>
+        </w:tc>
+        <w:tc>
+          <w:tcPr>
+            <w:tcW w:type="dxa" w:w="1728"/>
+          </w:tcPr>
+          <w:p>
+            <w:r>
+              <w:t>Lab 4, Lab 5</w:t>
             </w:r>
           </w:p>
         </w:tc>
@@ -1070,7 +1133,7 @@
       <w:tr>
         <w:tc>
           <w:tcPr>
-            <w:tcW w:type="dxa" w:w="2160"/>
+            <w:tcW w:type="dxa" w:w="1728"/>
           </w:tcPr>
           <w:p>
             <w:r>
@@ -1080,157 +1143,41 @@
         </w:tc>
         <w:tc>
           <w:tcPr>
-            <w:tcW w:type="dxa" w:w="2160"/>
+            <w:tcW w:type="dxa" w:w="1728"/>
           </w:tcPr>
           <w:p>
             <w:r>
-              <w:t>Topic 03 - Customer Experience and Tool-Using Agents</w:t>
+              <w:t>Topic 03 - Video Agent</w:t>
             </w:r>
           </w:p>
         </w:tc>
         <w:tc>
           <w:tcPr>
-            <w:tcW w:type="dxa" w:w="2160"/>
+            <w:tcW w:type="dxa" w:w="1728"/>
           </w:tcPr>
           <w:p>
             <w:r>
-              <w:t>Turn retrieval into a workplace assistant that can answer customer questions, collect structured data, and call workflow tools.</w:t>
+              <w:t>Lip-sync, avatars and text-to-video: from a script, to a mouth that moves, to a face that talks back, to video from nothing but a sentence. Labs 6-10.</w:t>
             </w:r>
           </w:p>
         </w:tc>
         <w:tc>
           <w:tcPr>
-            <w:tcW w:type="dxa" w:w="2160"/>
+            <w:tcW w:type="dxa" w:w="1728"/>
           </w:tcPr>
           <w:p>
             <w:r>
-              <w:t>Lab 3.1, Lab 3.2, Lab 3.3, Lab 3.4</w:t>
-            </w:r>
-          </w:p>
-        </w:tc>
-      </w:tr>
-      <w:tr>
-        <w:tc>
-          <w:tcPr>
-            <w:tcW w:type="dxa" w:w="2160"/>
-          </w:tcPr>
-          <w:p>
-            <w:r>
-              <w:t>4</w:t>
+              <w:t>LO3 (K4, K5, A2, A6)</w:t>
             </w:r>
           </w:p>
         </w:tc>
         <w:tc>
           <w:tcPr>
-            <w:tcW w:type="dxa" w:w="2160"/>
+            <w:tcW w:type="dxa" w:w="1728"/>
           </w:tcPr>
           <w:p>
             <w:r>
-              <w:t>Topic 04 - Voice AI Agents</w:t>
-            </w:r>
-          </w:p>
-        </w:tc>
-        <w:tc>
-          <w:tcPr>
-            <w:tcW w:type="dxa" w:w="2160"/>
-          </w:tcPr>
-          <w:p>
-            <w:r>
-              <w:t>Design, connect, test, and improve a voice booking agent using Retell, n8n webhooks, and a browser front end.</w:t>
-            </w:r>
-          </w:p>
-        </w:tc>
-        <w:tc>
-          <w:tcPr>
-            <w:tcW w:type="dxa" w:w="2160"/>
-          </w:tcPr>
-          <w:p>
-            <w:r>
-              <w:t>Lab 4.1, Lab 4.2, Lab 4.3, Lab 4.4, Lab 4.5, Lab 4.6, Lab 4.7, Lab 4.8</w:t>
-            </w:r>
-          </w:p>
-        </w:tc>
-      </w:tr>
-      <w:tr>
-        <w:tc>
-          <w:tcPr>
-            <w:tcW w:type="dxa" w:w="2160"/>
-          </w:tcPr>
-          <w:p>
-            <w:r>
-              <w:t>5</w:t>
-            </w:r>
-          </w:p>
-        </w:tc>
-        <w:tc>
-          <w:tcPr>
-            <w:tcW w:type="dxa" w:w="2160"/>
-          </w:tcPr>
-          <w:p>
-            <w:r>
-              <w:t>Topic 05 - AI Video and Avatar Automation</w:t>
-            </w:r>
-          </w:p>
-        </w:tc>
-        <w:tc>
-          <w:tcPr>
-            <w:tcW w:type="dxa" w:w="2160"/>
-          </w:tcPr>
-          <w:p>
-            <w:r>
-              <w:t>Generate scripts, avatar videos, text-to-video clips with Veo 3.1, and open-source talking-head video pipelines that run entirely on the learner's own machine.</w:t>
-            </w:r>
-          </w:p>
-        </w:tc>
-        <w:tc>
-          <w:tcPr>
-            <w:tcW w:type="dxa" w:w="2160"/>
-          </w:tcPr>
-          <w:p>
-            <w:r>
-              <w:t>Lab 5.1, Lab 5.2, Lab 5.3, Lab 5.4, Lab 5.5</w:t>
-            </w:r>
-          </w:p>
-        </w:tc>
-      </w:tr>
-      <w:tr>
-        <w:tc>
-          <w:tcPr>
-            <w:tcW w:type="dxa" w:w="2160"/>
-          </w:tcPr>
-          <w:p>
-            <w:r>
-              <w:t>6</w:t>
-            </w:r>
-          </w:p>
-        </w:tc>
-        <w:tc>
-          <w:tcPr>
-            <w:tcW w:type="dxa" w:w="2160"/>
-          </w:tcPr>
-          <w:p>
-            <w:r>
-              <w:t>Topic 06 - Publishing, Interactive Avatars, and Capstone Operations</w:t>
-            </w:r>
-          </w:p>
-        </w:tc>
-        <w:tc>
-          <w:tcPr>
-            <w:tcW w:type="dxa" w:w="2160"/>
-          </w:tcPr>
-          <w:p>
-            <w:r>
-              <w:t>Publish video outputs, deploy interactive avatars, monitor automations, and assemble a production-ready AI workforce capstone.</w:t>
-            </w:r>
-          </w:p>
-        </w:tc>
-        <w:tc>
-          <w:tcPr>
-            <w:tcW w:type="dxa" w:w="2160"/>
-          </w:tcPr>
-          <w:p>
-            <w:r>
-              <w:t>Lab 6.1, Lab 6.2, Lab 6.3, Lab 6.4, Lab 6.5</w:t>
+              <w:t>Lab 6, Lab 7, Lab 7-os, Lab 8, Lab 9, Lab 10</w:t>
             </w:r>
           </w:p>
         </w:tc>
@@ -1248,7 +1195,7 @@
     <w:p/>
     <w:p>
       <w:r>
-        <w:t>Total taught content: 32 hours 30 minutes across 29 labs.</w:t>
+        <w:t>Total taught content: 12 hours 00 minutes across 12 labs.</w:t>
       </w:r>
     </w:p>
     <w:p/>
@@ -1333,7 +1280,111 @@
           </w:tcPr>
           <w:p>
             <w:r>
-              <w:t>9:30am - 10:30am</w:t>
+              <w:t>9:30am - 10:15am</w:t>
+            </w:r>
+          </w:p>
+        </w:tc>
+        <w:tc>
+          <w:tcPr>
+            <w:tcW w:type="dxa" w:w="1728"/>
+          </w:tcPr>
+          <w:p>
+            <w:r>
+              <w:t>45 min</w:t>
+            </w:r>
+          </w:p>
+        </w:tc>
+        <w:tc>
+          <w:tcPr>
+            <w:tcW w:type="dxa" w:w="1728"/>
+          </w:tcPr>
+          <w:p>
+            <w:r>
+              <w:t>Lab 0 - Set Up n8n Locally</w:t>
+            </w:r>
+          </w:p>
+        </w:tc>
+        <w:tc>
+          <w:tcPr>
+            <w:tcW w:type="dxa" w:w="1728"/>
+          </w:tcPr>
+          <w:p>
+            <w:r>
+              <w:t>Slide 23</w:t>
+            </w:r>
+          </w:p>
+        </w:tc>
+        <w:tc>
+          <w:tcPr>
+            <w:tcW w:type="dxa" w:w="1728"/>
+          </w:tcPr>
+          <w:p>
+            <w:r>
+              <w:t>A running local stack: screenshots of docker compose ps, ollama list and the passing credential test.</w:t>
+            </w:r>
+          </w:p>
+        </w:tc>
+      </w:tr>
+      <w:tr>
+        <w:tc>
+          <w:tcPr>
+            <w:tcW w:type="dxa" w:w="1728"/>
+          </w:tcPr>
+          <w:p>
+            <w:r>
+              <w:t>10:15am - 11:00am</w:t>
+            </w:r>
+          </w:p>
+        </w:tc>
+        <w:tc>
+          <w:tcPr>
+            <w:tcW w:type="dxa" w:w="1728"/>
+          </w:tcPr>
+          <w:p>
+            <w:r>
+              <w:t>45 min</w:t>
+            </w:r>
+          </w:p>
+        </w:tc>
+        <w:tc>
+          <w:tcPr>
+            <w:tcW w:type="dxa" w:w="1728"/>
+          </w:tcPr>
+          <w:p>
+            <w:r>
+              <w:t>Lab 1 - Your First AI Agent</w:t>
+            </w:r>
+          </w:p>
+        </w:tc>
+        <w:tc>
+          <w:tcPr>
+            <w:tcW w:type="dxa" w:w="1728"/>
+          </w:tcPr>
+          <w:p>
+            <w:r>
+              <w:t>Slide 29</w:t>
+            </w:r>
+          </w:p>
+        </w:tc>
+        <w:tc>
+          <w:tcPr>
+            <w:tcW w:type="dxa" w:w="1728"/>
+          </w:tcPr>
+          <w:p>
+            <w:r>
+              <w:t>A working local agent plus a one-line note on how the system prompt changed its behaviour.</w:t>
+            </w:r>
+          </w:p>
+        </w:tc>
+      </w:tr>
+      <w:tr>
+        <w:tc>
+          <w:tcPr>
+            <w:tcW w:type="dxa" w:w="1728"/>
+          </w:tcPr>
+          <w:p>
+            <w:r>
+              <w:t>11:00am - 12:00pm</w:t>
             </w:r>
           </w:p>
         </w:tc>
@@ -1353,7 +1404,7 @@
           </w:tcPr>
           <w:p>
             <w:r>
-              <w:t>Lab 1.1 - Set Up the Local AI Automation Workstation</w:t>
+              <w:t>Lab 2 - RAG IT Support Chatbot</w:t>
             </w:r>
           </w:p>
         </w:tc>
@@ -1363,7 +1414,7 @@
           </w:tcPr>
           <w:p>
             <w:r>
-              <w:t>Slide 13</w:t>
+              <w:t>Slide 35</w:t>
             </w:r>
           </w:p>
         </w:tc>
@@ -1373,111 +1424,7 @@
           </w:tcPr>
           <w:p>
             <w:r>
-              <w:t>A checked workstation screenshot plus a short note explaining the local architecture.</w:t>
-            </w:r>
-          </w:p>
-        </w:tc>
-      </w:tr>
-      <w:tr>
-        <w:tc>
-          <w:tcPr>
-            <w:tcW w:type="dxa" w:w="1728"/>
-          </w:tcPr>
-          <w:p>
-            <w:r>
-              <w:t>10:30am - 11:15am</w:t>
-            </w:r>
-          </w:p>
-        </w:tc>
-        <w:tc>
-          <w:tcPr>
-            <w:tcW w:type="dxa" w:w="1728"/>
-          </w:tcPr>
-          <w:p>
-            <w:r>
-              <w:t>45 min</w:t>
-            </w:r>
-          </w:p>
-        </w:tc>
-        <w:tc>
-          <w:tcPr>
-            <w:tcW w:type="dxa" w:w="1728"/>
-          </w:tcPr>
-          <w:p>
-            <w:r>
-              <w:t>Lab 1.2 - Map the Agentic AI Loop Before Building</w:t>
-            </w:r>
-          </w:p>
-        </w:tc>
-        <w:tc>
-          <w:tcPr>
-            <w:tcW w:type="dxa" w:w="1728"/>
-          </w:tcPr>
-          <w:p>
-            <w:r>
-              <w:t>Slide 19</w:t>
-            </w:r>
-          </w:p>
-        </w:tc>
-        <w:tc>
-          <w:tcPr>
-            <w:tcW w:type="dxa" w:w="1728"/>
-          </w:tcPr>
-          <w:p>
-            <w:r>
-              <w:t>An agentic loop canvas ready to guide the remaining labs.</w:t>
-            </w:r>
-          </w:p>
-        </w:tc>
-      </w:tr>
-      <w:tr>
-        <w:tc>
-          <w:tcPr>
-            <w:tcW w:type="dxa" w:w="1728"/>
-          </w:tcPr>
-          <w:p>
-            <w:r>
-              <w:t>11:15am - 12:00pm</w:t>
-            </w:r>
-          </w:p>
-        </w:tc>
-        <w:tc>
-          <w:tcPr>
-            <w:tcW w:type="dxa" w:w="1728"/>
-          </w:tcPr>
-          <w:p>
-            <w:r>
-              <w:t>45 min</w:t>
-            </w:r>
-          </w:p>
-        </w:tc>
-        <w:tc>
-          <w:tcPr>
-            <w:tcW w:type="dxa" w:w="1728"/>
-          </w:tcPr>
-          <w:p>
-            <w:r>
-              <w:t>Lab 1.3 - Create a Workflow Quality Baseline</w:t>
-            </w:r>
-          </w:p>
-        </w:tc>
-        <w:tc>
-          <w:tcPr>
-            <w:tcW w:type="dxa" w:w="1728"/>
-          </w:tcPr>
-          <w:p>
-            <w:r>
-              <w:t>Slide 24</w:t>
-            </w:r>
-          </w:p>
-        </w:tc>
-        <w:tc>
-          <w:tcPr>
-            <w:tcW w:type="dxa" w:w="1728"/>
-          </w:tcPr>
-          <w:p>
-            <w:r>
-              <w:t>A baseline quality checklist plus a saved echo workflow checkpoint.</w:t>
+              <w:t>A RAG chatbot answering from the IT FAQ, plus one provoked refusal captured in the execution trace.</w:t>
             </w:r>
           </w:p>
         </w:tc>
@@ -1509,7 +1456,7 @@
           </w:tcPr>
           <w:p>
             <w:r>
-              <w:t>Lab 2.1 - Build Your First Local AI Agent</w:t>
+              <w:t>Lab 3 - CX Agent with RAG (Cook &amp; Bake Academy)</w:t>
             </w:r>
           </w:p>
         </w:tc>
@@ -1519,7 +1466,7 @@
           </w:tcPr>
           <w:p>
             <w:r>
-              <w:t>Slide 35</w:t>
+              <w:t>Slide 42</w:t>
             </w:r>
           </w:p>
         </w:tc>
@@ -1529,7 +1476,7 @@
           </w:tcPr>
           <w:p>
             <w:r>
-              <w:t>A working local AI agent with a documented system message.</w:t>
+              <w:t>A working course-advisory chatbot on the site, with one grounded answer and one honest refusal in the trace.</w:t>
             </w:r>
           </w:p>
         </w:tc>
@@ -1593,7 +1540,7 @@
           </w:tcPr>
           <w:p>
             <w:r>
-              <w:t>2:00pm - 2:45pm</w:t>
+              <w:t>2:00pm - 4:00pm</w:t>
             </w:r>
           </w:p>
         </w:tc>
@@ -1603,7 +1550,7 @@
           </w:tcPr>
           <w:p>
             <w:r>
-              <w:t>45 min</w:t>
+              <w:t>120 min</w:t>
             </w:r>
           </w:p>
         </w:tc>
@@ -1613,7 +1560,7 @@
           </w:tcPr>
           <w:p>
             <w:r>
-              <w:t>Lab 2.2 - Add Memory and Session Design</w:t>
+              <w:t>Lab 4 - Voice Booking Agent with ElevenLabs (GG Hair Salon)</w:t>
             </w:r>
           </w:p>
         </w:tc>
@@ -1623,7 +1570,7 @@
           </w:tcPr>
           <w:p>
             <w:r>
-              <w:t>Slide 41</w:t>
+              <w:t>Slide 55</w:t>
             </w:r>
           </w:p>
         </w:tc>
@@ -1633,7 +1580,7 @@
           </w:tcPr>
           <w:p>
             <w:r>
-              <w:t>A memory-enabled agent and a privacy note.</w:t>
+              <w:t>A real calendar booking made by voice: the calendar event, the call transcript, and the n8n tool execution.</w:t>
             </w:r>
           </w:p>
         </w:tc>
@@ -1645,7 +1592,7 @@
           </w:tcPr>
           <w:p>
             <w:r>
-              <w:t>2:45pm - 4:00pm</w:t>
+              <w:t>4:00pm - 5:30pm</w:t>
             </w:r>
           </w:p>
         </w:tc>
@@ -1655,7 +1602,7 @@
           </w:tcPr>
           <w:p>
             <w:r>
-              <w:t>75 min</w:t>
+              <w:t>90 min</w:t>
             </w:r>
           </w:p>
         </w:tc>
@@ -1665,7 +1612,7 @@
           </w:tcPr>
           <w:p>
             <w:r>
-              <w:t>Lab 2.3 - Build a PDF RAG IT Support Agent</w:t>
+              <w:t>Lab 5 - Grounded FAQ Voice Agent with Vapi (MediRefill)</w:t>
             </w:r>
           </w:p>
         </w:tc>
@@ -1675,7 +1622,7 @@
           </w:tcPr>
           <w:p>
             <w:r>
-              <w:t>Slide 46</w:t>
+              <w:t>Slide 62</w:t>
             </w:r>
           </w:p>
         </w:tc>
@@ -1685,7 +1632,7 @@
           </w:tcPr>
           <w:p>
             <w:r>
-              <w:t>A RAG chatbot that answers from the IT FAQ and refuses unrelated questions.</w:t>
+              <w:t>A live Vapi call transcript showing grounded answers, a hard medical refusal, and the emergency escalation.</w:t>
             </w:r>
           </w:p>
         </w:tc>
@@ -1697,7 +1644,7 @@
           </w:tcPr>
           <w:p>
             <w:r>
-              <w:t>4:00pm - 5:00pm</w:t>
+              <w:t>5:30pm - 6:30pm</w:t>
             </w:r>
           </w:p>
         </w:tc>
@@ -1708,110 +1655,6 @@
           <w:p>
             <w:r>
               <w:t>60 min</w:t>
-            </w:r>
-          </w:p>
-        </w:tc>
-        <w:tc>
-          <w:tcPr>
-            <w:tcW w:type="dxa" w:w="1728"/>
-          </w:tcPr>
-          <w:p>
-            <w:r>
-              <w:t>Lab 2.4 - Improve RAG with Chunking and Evaluation</w:t>
-            </w:r>
-          </w:p>
-        </w:tc>
-        <w:tc>
-          <w:tcPr>
-            <w:tcW w:type="dxa" w:w="1728"/>
-          </w:tcPr>
-          <w:p>
-            <w:r>
-              <w:t>Slide 53</w:t>
-            </w:r>
-          </w:p>
-        </w:tc>
-        <w:tc>
-          <w:tcPr>
-            <w:tcW w:type="dxa" w:w="1728"/>
-          </w:tcPr>
-          <w:p>
-            <w:r>
-              <w:t>A RAG evaluation sheet and selected chunking configuration.</w:t>
-            </w:r>
-          </w:p>
-        </w:tc>
-      </w:tr>
-      <w:tr>
-        <w:tc>
-          <w:tcPr>
-            <w:tcW w:type="dxa" w:w="1728"/>
-          </w:tcPr>
-          <w:p>
-            <w:r>
-              <w:t>5:00pm - 6:15pm</w:t>
-            </w:r>
-          </w:p>
-        </w:tc>
-        <w:tc>
-          <w:tcPr>
-            <w:tcW w:type="dxa" w:w="1728"/>
-          </w:tcPr>
-          <w:p>
-            <w:r>
-              <w:t>75 min</w:t>
-            </w:r>
-          </w:p>
-        </w:tc>
-        <w:tc>
-          <w:tcPr>
-            <w:tcW w:type="dxa" w:w="1728"/>
-          </w:tcPr>
-          <w:p>
-            <w:r>
-              <w:t>Lab 3.1 - Build a Course Advisory CX Agent</w:t>
-            </w:r>
-          </w:p>
-        </w:tc>
-        <w:tc>
-          <w:tcPr>
-            <w:tcW w:type="dxa" w:w="1728"/>
-          </w:tcPr>
-          <w:p>
-            <w:r>
-              <w:t>Slide 59</w:t>
-            </w:r>
-          </w:p>
-        </w:tc>
-        <w:tc>
-          <w:tcPr>
-            <w:tcW w:type="dxa" w:w="1728"/>
-          </w:tcPr>
-          <w:p>
-            <w:r>
-              <w:t>A working course advisory chatbot embedded in the sample website.</w:t>
-            </w:r>
-          </w:p>
-        </w:tc>
-      </w:tr>
-      <w:tr>
-        <w:tc>
-          <w:tcPr>
-            <w:tcW w:type="dxa" w:w="1728"/>
-          </w:tcPr>
-          <w:p>
-            <w:r>
-              <w:t>6:15pm - 6:30pm</w:t>
-            </w:r>
-          </w:p>
-        </w:tc>
-        <w:tc>
-          <w:tcPr>
-            <w:tcW w:type="dxa" w:w="1728"/>
-          </w:tcPr>
-          <w:p>
-            <w:r>
-              <w:t>15 min</w:t>
             </w:r>
           </w:p>
         </w:tc>
@@ -1955,7 +1798,7 @@
           </w:tcPr>
           <w:p>
             <w:r>
-              <w:t>Lab 3.2 - Add Structured Lead Capture</w:t>
+              <w:t>Lab 6 - Lip-Sync Face-Off: MuseTalk vs HeyGen</w:t>
             </w:r>
           </w:p>
         </w:tc>
@@ -1965,7 +1808,7 @@
           </w:tcPr>
           <w:p>
             <w:r>
-              <w:t>Slide 67</w:t>
+              <w:t>Slide 73</w:t>
             </w:r>
           </w:p>
         </w:tc>
@@ -1975,7 +1818,7 @@
           </w:tcPr>
           <w:p>
             <w:r>
-              <w:t>A structured lead capture branch ready for CRM or spreadsheet integration.</w:t>
+              <w:t>Two rendered clips of one script, a scored comparison, and a one-line recommendation per engine.</w:t>
             </w:r>
           </w:p>
         </w:tc>
@@ -1987,7 +1830,7 @@
           </w:tcPr>
           <w:p>
             <w:r>
-              <w:t>10:30am - 11:30am</w:t>
+              <w:t>10:30am - 11:15am</w:t>
             </w:r>
           </w:p>
         </w:tc>
@@ -1997,7 +1840,7 @@
           </w:tcPr>
           <w:p>
             <w:r>
-              <w:t>60 min</w:t>
+              <w:t>45 min</w:t>
             </w:r>
           </w:p>
         </w:tc>
@@ -2007,7 +1850,7 @@
           </w:tcPr>
           <w:p>
             <w:r>
-              <w:t>Lab 3.3 - Create a Tool-Calling Booking Request Agent</w:t>
+              <w:t>Lab 7 - Avatar News Video with HeyGen (GG News Studio)</w:t>
             </w:r>
           </w:p>
         </w:tc>
@@ -2017,7 +1860,7 @@
           </w:tcPr>
           <w:p>
             <w:r>
-              <w:t>Slide 72</w:t>
+              <w:t>Slide 80</w:t>
             </w:r>
           </w:p>
         </w:tc>
@@ -2027,7 +1870,7 @@
           </w:tcPr>
           <w:p>
             <w:r>
-              <w:t>A safe mock booking request workflow.</w:t>
+              <w:t>A generated avatar news video plus quality-review notes on the script and the render.</w:t>
             </w:r>
           </w:p>
         </w:tc>
@@ -2039,7 +1882,7 @@
           </w:tcPr>
           <w:p>
             <w:r>
-              <w:t>11:30am - 12:30pm</w:t>
+              <w:t>11:15am - 12:00pm</w:t>
             </w:r>
           </w:p>
         </w:tc>
@@ -2049,7 +1892,7 @@
           </w:tcPr>
           <w:p>
             <w:r>
-              <w:t>60 min</w:t>
+              <w:t>45 min</w:t>
             </w:r>
           </w:p>
         </w:tc>
@@ -2059,111 +1902,7 @@
           </w:tcPr>
           <w:p>
             <w:r>
-              <w:t>Lab 3.4 - Add Safety Guardrails and Escalation</w:t>
-            </w:r>
-          </w:p>
-        </w:tc>
-        <w:tc>
-          <w:tcPr>
-            <w:tcW w:type="dxa" w:w="1728"/>
-          </w:tcPr>
-          <w:p>
-            <w:r>
-              <w:t>Slide 77</w:t>
-            </w:r>
-          </w:p>
-        </w:tc>
-        <w:tc>
-          <w:tcPr>
-            <w:tcW w:type="dxa" w:w="1728"/>
-          </w:tcPr>
-          <w:p>
-            <w:r>
-              <w:t>A guardrail test set and passing CX workflow.</w:t>
-            </w:r>
-          </w:p>
-        </w:tc>
-      </w:tr>
-      <w:tr>
-        <w:tc>
-          <w:tcPr>
-            <w:tcW w:type="dxa" w:w="1728"/>
-          </w:tcPr>
-          <w:p>
-            <w:r>
-              <w:t>12:30pm - 1:30pm</w:t>
-            </w:r>
-          </w:p>
-        </w:tc>
-        <w:tc>
-          <w:tcPr>
-            <w:tcW w:type="dxa" w:w="1728"/>
-          </w:tcPr>
-          <w:p>
-            <w:r>
-              <w:t>60 min</w:t>
-            </w:r>
-          </w:p>
-        </w:tc>
-        <w:tc>
-          <w:tcPr>
-            <w:tcW w:type="dxa" w:w="1728"/>
-          </w:tcPr>
-          <w:p>
-            <w:r>
-              <w:t>LUNCH</w:t>
-            </w:r>
-          </w:p>
-        </w:tc>
-        <w:tc>
-          <w:tcPr>
-            <w:tcW w:type="dxa" w:w="1728"/>
-          </w:tcPr>
-          <w:p>
-            <w:r>
-              <w:t>-</w:t>
-            </w:r>
-          </w:p>
-        </w:tc>
-        <w:tc>
-          <w:tcPr>
-            <w:tcW w:type="dxa" w:w="1728"/>
-          </w:tcPr>
-          <w:p>
-            <w:r>
-              <w:t>-</w:t>
-            </w:r>
-          </w:p>
-        </w:tc>
-      </w:tr>
-      <w:tr>
-        <w:tc>
-          <w:tcPr>
-            <w:tcW w:type="dxa" w:w="1728"/>
-          </w:tcPr>
-          <w:p>
-            <w:r>
-              <w:t>1:30pm - 2:30pm</w:t>
-            </w:r>
-          </w:p>
-        </w:tc>
-        <w:tc>
-          <w:tcPr>
-            <w:tcW w:type="dxa" w:w="1728"/>
-          </w:tcPr>
-          <w:p>
-            <w:r>
-              <w:t>60 min</w:t>
-            </w:r>
-          </w:p>
-        </w:tc>
-        <w:tc>
-          <w:tcPr>
-            <w:tcW w:type="dxa" w:w="1728"/>
-          </w:tcPr>
-          <w:p>
-            <w:r>
-              <w:t>Lab 4.1 - Design a Voice Agent Conversation</w:t>
+              <w:t>Lab 7-os - Open-Source News Avatar - Free and Local</w:t>
             </w:r>
           </w:p>
         </w:tc>
@@ -2183,7 +1922,7 @@
           </w:tcPr>
           <w:p>
             <w:r>
-              <w:t>A tested voice conversation design script.</w:t>
+              <w:t>A locally rendered news video and a written HeyGen-versus-local comparison.</w:t>
             </w:r>
           </w:p>
         </w:tc>
@@ -2195,163 +1934,7 @@
           </w:tcPr>
           <w:p>
             <w:r>
-              <w:t>2:30pm - 3:45pm</w:t>
-            </w:r>
-          </w:p>
-        </w:tc>
-        <w:tc>
-          <w:tcPr>
-            <w:tcW w:type="dxa" w:w="1728"/>
-          </w:tcPr>
-          <w:p>
-            <w:r>
-              <w:t>75 min</w:t>
-            </w:r>
-          </w:p>
-        </w:tc>
-        <w:tc>
-          <w:tcPr>
-            <w:tcW w:type="dxa" w:w="1728"/>
-          </w:tcPr>
-          <w:p>
-            <w:r>
-              <w:t>Lab 4.2 - Connect Retell Web Calls Through n8n</w:t>
-            </w:r>
-          </w:p>
-        </w:tc>
-        <w:tc>
-          <w:tcPr>
-            <w:tcW w:type="dxa" w:w="1728"/>
-          </w:tcPr>
-          <w:p>
-            <w:r>
-              <w:t>Slide 93</w:t>
-            </w:r>
-          </w:p>
-        </w:tc>
-        <w:tc>
-          <w:tcPr>
-            <w:tcW w:type="dxa" w:w="1728"/>
-          </w:tcPr>
-          <w:p>
-            <w:r>
-              <w:t>A secure browser-to-Retell call flow.</w:t>
-            </w:r>
-          </w:p>
-        </w:tc>
-      </w:tr>
-      <w:tr>
-        <w:tc>
-          <w:tcPr>
-            <w:tcW w:type="dxa" w:w="1728"/>
-          </w:tcPr>
-          <w:p>
-            <w:r>
-              <w:t>3:45pm - 4:45pm</w:t>
-            </w:r>
-          </w:p>
-        </w:tc>
-        <w:tc>
-          <w:tcPr>
-            <w:tcW w:type="dxa" w:w="1728"/>
-          </w:tcPr>
-          <w:p>
-            <w:r>
-              <w:t>60 min</w:t>
-            </w:r>
-          </w:p>
-        </w:tc>
-        <w:tc>
-          <w:tcPr>
-            <w:tcW w:type="dxa" w:w="1728"/>
-          </w:tcPr>
-          <w:p>
-            <w:r>
-              <w:t>Lab 4.3 - QA the Voice Agent with Call Analytics</w:t>
-            </w:r>
-          </w:p>
-        </w:tc>
-        <w:tc>
-          <w:tcPr>
-            <w:tcW w:type="dxa" w:w="1728"/>
-          </w:tcPr>
-          <w:p>
-            <w:r>
-              <w:t>Slide 103</w:t>
-            </w:r>
-          </w:p>
-        </w:tc>
-        <w:tc>
-          <w:tcPr>
-            <w:tcW w:type="dxa" w:w="1728"/>
-          </w:tcPr>
-          <w:p>
-            <w:r>
-              <w:t>A voice QA scorecard and one improved voice prompt.</w:t>
-            </w:r>
-          </w:p>
-        </w:tc>
-      </w:tr>
-      <w:tr>
-        <w:tc>
-          <w:tcPr>
-            <w:tcW w:type="dxa" w:w="1728"/>
-          </w:tcPr>
-          <w:p>
-            <w:r>
-              <w:t>4:45pm - 5:45pm</w:t>
-            </w:r>
-          </w:p>
-        </w:tc>
-        <w:tc>
-          <w:tcPr>
-            <w:tcW w:type="dxa" w:w="1728"/>
-          </w:tcPr>
-          <w:p>
-            <w:r>
-              <w:t>60 min</w:t>
-            </w:r>
-          </w:p>
-        </w:tc>
-        <w:tc>
-          <w:tcPr>
-            <w:tcW w:type="dxa" w:w="1728"/>
-          </w:tcPr>
-          <w:p>
-            <w:r>
-              <w:t>Lab 4.4 - Add Human Handoff and Notifications</w:t>
-            </w:r>
-          </w:p>
-        </w:tc>
-        <w:tc>
-          <w:tcPr>
-            <w:tcW w:type="dxa" w:w="1728"/>
-          </w:tcPr>
-          <w:p>
-            <w:r>
-              <w:t>Slide 108</w:t>
-            </w:r>
-          </w:p>
-        </w:tc>
-        <w:tc>
-          <w:tcPr>
-            <w:tcW w:type="dxa" w:w="1728"/>
-          </w:tcPr>
-          <w:p>
-            <w:r>
-              <w:t>A staff handoff branch for bookings and escalations.</w:t>
-            </w:r>
-          </w:p>
-        </w:tc>
-      </w:tr>
-      <w:tr>
-        <w:tc>
-          <w:tcPr>
-            <w:tcW w:type="dxa" w:w="1728"/>
-          </w:tcPr>
-          <w:p>
-            <w:r>
-              <w:t>5:45pm - 6:30pm</w:t>
+              <w:t>12:00pm - 12:45pm</w:t>
             </w:r>
           </w:p>
         </w:tc>
@@ -2371,7 +1954,7 @@
           </w:tcPr>
           <w:p>
             <w:r>
-              <w:t>Concept delivery, review and evidence check - the trainer teaches the concept, workflow and quality slides for the day's labs, then learners show their executions, transcripts and scorecards</w:t>
+              <w:t>Lab 8 - Interactive Avatar Brain (Aria, In-Browser)</w:t>
             </w:r>
           </w:p>
         </w:tc>
@@ -2381,7 +1964,7 @@
           </w:tcPr>
           <w:p>
             <w:r>
-              <w:t>-</w:t>
+              <w:t>Slide 92</w:t>
             </w:r>
           </w:p>
         </w:tc>
@@ -2391,245 +1974,7 @@
           </w:tcPr>
           <w:p>
             <w:r>
-              <w:t>Trainer sign-off on the day's evidence</w:t>
-            </w:r>
-          </w:p>
-        </w:tc>
-      </w:tr>
-    </w:tbl>
-    <w:p/>
-    <w:p>
-      <w:r>
-        <w:t>Day 2 instructional time: 8h 00m (9:30am-6:30pm, less a 1-hour lunch; tea breaks are taken inside the sessions).</w:t>
-      </w:r>
-    </w:p>
-    <w:p/>
-    <w:p>
-      <w:pPr>
-        <w:pStyle w:val="Heading2"/>
-      </w:pPr>
-      <w:r>
-        <w:t>Day 3</w:t>
-      </w:r>
-    </w:p>
-    <w:p/>
-    <w:tbl>
-      <w:tblPr>
-        <w:tblStyle w:val="LightGrid-Accent1"/>
-        <w:tblW w:type="auto" w:w="0"/>
-        <w:tblLook w:firstColumn="1" w:firstRow="1" w:lastColumn="0" w:lastRow="0" w:noHBand="0" w:noVBand="1" w:val="04A0"/>
-      </w:tblPr>
-      <w:tblGrid>
-        <w:gridCol w:w="1728"/>
-        <w:gridCol w:w="1728"/>
-        <w:gridCol w:w="1728"/>
-        <w:gridCol w:w="1728"/>
-        <w:gridCol w:w="1728"/>
-      </w:tblGrid>
-      <w:tr>
-        <w:tc>
-          <w:tcPr>
-            <w:tcW w:type="dxa" w:w="1728"/>
-          </w:tcPr>
-          <w:p>
-            <w:r>
-              <w:t>Time</w:t>
-            </w:r>
-          </w:p>
-        </w:tc>
-        <w:tc>
-          <w:tcPr>
-            <w:tcW w:type="dxa" w:w="1728"/>
-          </w:tcPr>
-          <w:p>
-            <w:r>
-              <w:t>Duration</w:t>
-            </w:r>
-          </w:p>
-        </w:tc>
-        <w:tc>
-          <w:tcPr>
-            <w:tcW w:type="dxa" w:w="1728"/>
-          </w:tcPr>
-          <w:p>
-            <w:r>
-              <w:t>Topic / Activity</w:t>
-            </w:r>
-          </w:p>
-        </w:tc>
-        <w:tc>
-          <w:tcPr>
-            <w:tcW w:type="dxa" w:w="1728"/>
-          </w:tcPr>
-          <w:p>
-            <w:r>
-              <w:t>Deck</w:t>
-            </w:r>
-          </w:p>
-        </w:tc>
-        <w:tc>
-          <w:tcPr>
-            <w:tcW w:type="dxa" w:w="1728"/>
-          </w:tcPr>
-          <w:p>
-            <w:r>
-              <w:t>Evidence produced</w:t>
-            </w:r>
-          </w:p>
-        </w:tc>
-      </w:tr>
-      <w:tr>
-        <w:tc>
-          <w:tcPr>
-            <w:tcW w:type="dxa" w:w="1728"/>
-          </w:tcPr>
-          <w:p>
-            <w:r>
-              <w:t>9:30am - 10:30am</w:t>
-            </w:r>
-          </w:p>
-        </w:tc>
-        <w:tc>
-          <w:tcPr>
-            <w:tcW w:type="dxa" w:w="1728"/>
-          </w:tcPr>
-          <w:p>
-            <w:r>
-              <w:t>60 min</w:t>
-            </w:r>
-          </w:p>
-        </w:tc>
-        <w:tc>
-          <w:tcPr>
-            <w:tcW w:type="dxa" w:w="1728"/>
-          </w:tcPr>
-          <w:p>
-            <w:r>
-              <w:t>Lab 4.5 - Ground the Voice Agent with a Retell Knowledge Base</w:t>
-            </w:r>
-          </w:p>
-        </w:tc>
-        <w:tc>
-          <w:tcPr>
-            <w:tcW w:type="dxa" w:w="1728"/>
-          </w:tcPr>
-          <w:p>
-            <w:r>
-              <w:t>Slide 113</w:t>
-            </w:r>
-          </w:p>
-        </w:tc>
-        <w:tc>
-          <w:tcPr>
-            <w:tcW w:type="dxa" w:w="1728"/>
-          </w:tcPr>
-          <w:p>
-            <w:r>
-              <w:t>A Retell Knowledge Base attached to the voice agent, plus a transcript showing three grounded answers and one honest refusal.</w:t>
-            </w:r>
-          </w:p>
-        </w:tc>
-      </w:tr>
-      <w:tr>
-        <w:tc>
-          <w:tcPr>
-            <w:tcW w:type="dxa" w:w="1728"/>
-          </w:tcPr>
-          <w:p>
-            <w:r>
-              <w:t>10:30am - 11:30am</w:t>
-            </w:r>
-          </w:p>
-        </w:tc>
-        <w:tc>
-          <w:tcPr>
-            <w:tcW w:type="dxa" w:w="1728"/>
-          </w:tcPr>
-          <w:p>
-            <w:r>
-              <w:t>60 min</w:t>
-            </w:r>
-          </w:p>
-        </w:tc>
-        <w:tc>
-          <w:tcPr>
-            <w:tcW w:type="dxa" w:w="1728"/>
-          </w:tcPr>
-          <w:p>
-            <w:r>
-              <w:t>Lab 4.6 - Clone Your Own Voice and Give It to the Agent</w:t>
-            </w:r>
-          </w:p>
-        </w:tc>
-        <w:tc>
-          <w:tcPr>
-            <w:tcW w:type="dxa" w:w="1728"/>
-          </w:tcPr>
-          <w:p>
-            <w:r>
-              <w:t>Slide 122</w:t>
-            </w:r>
-          </w:p>
-        </w:tc>
-        <w:tc>
-          <w:tcPr>
-            <w:tcW w:type="dxa" w:w="1728"/>
-          </w:tcPr>
-          <w:p>
-            <w:r>
-              <w:t>A cloned voice used by the working voice agent, plus a short written note on consent and disclosure.</w:t>
-            </w:r>
-          </w:p>
-        </w:tc>
-      </w:tr>
-      <w:tr>
-        <w:tc>
-          <w:tcPr>
-            <w:tcW w:type="dxa" w:w="1728"/>
-          </w:tcPr>
-          <w:p>
-            <w:r>
-              <w:t>11:30am - 12:45pm</w:t>
-            </w:r>
-          </w:p>
-        </w:tc>
-        <w:tc>
-          <w:tcPr>
-            <w:tcW w:type="dxa" w:w="1728"/>
-          </w:tcPr>
-          <w:p>
-            <w:r>
-              <w:t>75 min</w:t>
-            </w:r>
-          </w:p>
-        </w:tc>
-        <w:tc>
-          <w:tcPr>
-            <w:tcW w:type="dxa" w:w="1728"/>
-          </w:tcPr>
-          <w:p>
-            <w:r>
-              <w:t>Lab 4.7 - Book the Appointment into Google Calendar</w:t>
-            </w:r>
-          </w:p>
-        </w:tc>
-        <w:tc>
-          <w:tcPr>
-            <w:tcW w:type="dxa" w:w="1728"/>
-          </w:tcPr>
-          <w:p>
-            <w:r>
-              <w:t>Slide 131</w:t>
-            </w:r>
-          </w:p>
-        </w:tc>
-        <w:tc>
-          <w:tcPr>
-            <w:tcW w:type="dxa" w:w="1728"/>
-          </w:tcPr>
-          <w:p>
-            <w:r>
-              <w:t>A voice booking that produces a real, correctly-timed Google Calendar event.</w:t>
+              <w:t>A conversation with Aria plus the latency-panel screenshot proving ~2 s replies.</w:t>
             </w:r>
           </w:p>
         </w:tc>
@@ -2693,7 +2038,7 @@
           </w:tcPr>
           <w:p>
             <w:r>
-              <w:t>1:45pm - 3:00pm</w:t>
+              <w:t>1:45pm - 2:30pm</w:t>
             </w:r>
           </w:p>
         </w:tc>
@@ -2703,7 +2048,7 @@
           </w:tcPr>
           <w:p>
             <w:r>
-              <w:t>75 min</w:t>
+              <w:t>45 min</w:t>
             </w:r>
           </w:p>
         </w:tc>
@@ -2713,7 +2058,7 @@
           </w:tcPr>
           <w:p>
             <w:r>
-              <w:t>Lab 4.8 - Build a FAQ Voice Agent with Vapi</w:t>
+              <w:t>Lab 9 - Interactive Avatar Session (Nova, HeyGen LiveAvatar)</w:t>
             </w:r>
           </w:p>
         </w:tc>
@@ -2723,7 +2068,7 @@
           </w:tcPr>
           <w:p>
             <w:r>
-              <w:t>Slide 139</w:t>
+              <w:t>Slide 98</w:t>
             </w:r>
           </w:p>
         </w:tc>
@@ -2733,7 +2078,7 @@
           </w:tcPr>
           <w:p>
             <w:r>
-              <w:t>A working Vapi FAQ voice agent whose brain is an n8n workflow, proven by a curl test, a live call and one honest refusal.</w:t>
+              <w:t>A working Nova session plus the two-column scorecard comparing her against the browser-rendered avatar.</w:t>
             </w:r>
           </w:p>
         </w:tc>
@@ -2745,59 +2090,7 @@
           </w:tcPr>
           <w:p>
             <w:r>
-              <w:t>3:00pm - 4:15pm</w:t>
-            </w:r>
-          </w:p>
-        </w:tc>
-        <w:tc>
-          <w:tcPr>
-            <w:tcW w:type="dxa" w:w="1728"/>
-          </w:tcPr>
-          <w:p>
-            <w:r>
-              <w:t>75 min</w:t>
-            </w:r>
-          </w:p>
-        </w:tc>
-        <w:tc>
-          <w:tcPr>
-            <w:tcW w:type="dxa" w:w="1728"/>
-          </w:tcPr>
-          <w:p>
-            <w:r>
-              <w:t>Lab 5.1 - Lip-Sync Face-Off: Wav2Lip vs MuseTalk vs HeyGen</w:t>
-            </w:r>
-          </w:p>
-        </w:tc>
-        <w:tc>
-          <w:tcPr>
-            <w:tcW w:type="dxa" w:w="1728"/>
-          </w:tcPr>
-          <w:p>
-            <w:r>
-              <w:t>Slide 152</w:t>
-            </w:r>
-          </w:p>
-        </w:tc>
-        <w:tc>
-          <w:tcPr>
-            <w:tcW w:type="dxa" w:w="1728"/>
-          </w:tcPr>
-          <w:p>
-            <w:r>
-              <w:t>A side-by-side MuseTalk/HeyGen render of one gemma4 script, a scored comparison, and a written recommendation.</w:t>
-            </w:r>
-          </w:p>
-        </w:tc>
-      </w:tr>
-      <w:tr>
-        <w:tc>
-          <w:tcPr>
-            <w:tcW w:type="dxa" w:w="1728"/>
-          </w:tcPr>
-          <w:p>
-            <w:r>
-              <w:t>4:15pm - 5:15pm</w:t>
+              <w:t>2:30pm - 3:30pm</w:t>
             </w:r>
           </w:p>
         </w:tc>
@@ -2817,7 +2110,7 @@
           </w:tcPr>
           <w:p>
             <w:r>
-              <w:t>Lab 5.2 - Build a Video Script Agent</w:t>
+              <w:t>Lab 10 - AI Video Generation with Gemini Veo 3 (Veo Studio)</w:t>
             </w:r>
           </w:p>
         </w:tc>
@@ -2827,7 +2120,7 @@
           </w:tcPr>
           <w:p>
             <w:r>
-              <w:t>Slide 161</w:t>
+              <w:t>Slide 104</w:t>
             </w:r>
           </w:p>
         </w:tc>
@@ -2837,7 +2130,7 @@
           </w:tcPr>
           <w:p>
             <w:r>
-              <w:t>A timed script and shot list ready for video generation.</w:t>
+              <w:t>A rendered Veo clip, the shot prompt that produced it, and a note on what changed between two prompt versions.</w:t>
             </w:r>
           </w:p>
         </w:tc>
@@ -2849,7 +2142,7 @@
           </w:tcPr>
           <w:p>
             <w:r>
-              <w:t>5:15pm - 6:30pm</w:t>
+              <w:t>3:30pm - 4:15pm</w:t>
             </w:r>
           </w:p>
         </w:tc>
@@ -2859,795 +2152,7 @@
           </w:tcPr>
           <w:p>
             <w:r>
-              <w:t>75 min</w:t>
-            </w:r>
-          </w:p>
-        </w:tc>
-        <w:tc>
-          <w:tcPr>
-            <w:tcW w:type="dxa" w:w="1728"/>
-          </w:tcPr>
-          <w:p>
-            <w:r>
-              <w:t>Concept delivery, review and evidence check - the trainer teaches the concept, workflow and quality slides for the day's labs, then learners show their executions, transcripts and scorecards</w:t>
-            </w:r>
-          </w:p>
-        </w:tc>
-        <w:tc>
-          <w:tcPr>
-            <w:tcW w:type="dxa" w:w="1728"/>
-          </w:tcPr>
-          <w:p>
-            <w:r>
-              <w:t>-</w:t>
-            </w:r>
-          </w:p>
-        </w:tc>
-        <w:tc>
-          <w:tcPr>
-            <w:tcW w:type="dxa" w:w="1728"/>
-          </w:tcPr>
-          <w:p>
-            <w:r>
-              <w:t>Trainer sign-off on the day's evidence</w:t>
-            </w:r>
-          </w:p>
-        </w:tc>
-      </w:tr>
-    </w:tbl>
-    <w:p/>
-    <w:p>
-      <w:r>
-        <w:t>Day 3 instructional time: 8h 00m (9:30am-6:30pm, less a 1-hour lunch; tea breaks are taken inside the sessions).</w:t>
-      </w:r>
-    </w:p>
-    <w:p/>
-    <w:p>
-      <w:pPr>
-        <w:pStyle w:val="Heading2"/>
-      </w:pPr>
-      <w:r>
-        <w:t>Day 4</w:t>
-      </w:r>
-    </w:p>
-    <w:p/>
-    <w:tbl>
-      <w:tblPr>
-        <w:tblStyle w:val="LightGrid-Accent1"/>
-        <w:tblW w:type="auto" w:w="0"/>
-        <w:tblLook w:firstColumn="1" w:firstRow="1" w:lastColumn="0" w:lastRow="0" w:noHBand="0" w:noVBand="1" w:val="04A0"/>
-      </w:tblPr>
-      <w:tblGrid>
-        <w:gridCol w:w="1728"/>
-        <w:gridCol w:w="1728"/>
-        <w:gridCol w:w="1728"/>
-        <w:gridCol w:w="1728"/>
-        <w:gridCol w:w="1728"/>
-      </w:tblGrid>
-      <w:tr>
-        <w:tc>
-          <w:tcPr>
-            <w:tcW w:type="dxa" w:w="1728"/>
-          </w:tcPr>
-          <w:p>
-            <w:r>
-              <w:t>Time</w:t>
-            </w:r>
-          </w:p>
-        </w:tc>
-        <w:tc>
-          <w:tcPr>
-            <w:tcW w:type="dxa" w:w="1728"/>
-          </w:tcPr>
-          <w:p>
-            <w:r>
-              <w:t>Duration</w:t>
-            </w:r>
-          </w:p>
-        </w:tc>
-        <w:tc>
-          <w:tcPr>
-            <w:tcW w:type="dxa" w:w="1728"/>
-          </w:tcPr>
-          <w:p>
-            <w:r>
-              <w:t>Topic / Activity</w:t>
-            </w:r>
-          </w:p>
-        </w:tc>
-        <w:tc>
-          <w:tcPr>
-            <w:tcW w:type="dxa" w:w="1728"/>
-          </w:tcPr>
-          <w:p>
-            <w:r>
-              <w:t>Deck</w:t>
-            </w:r>
-          </w:p>
-        </w:tc>
-        <w:tc>
-          <w:tcPr>
-            <w:tcW w:type="dxa" w:w="1728"/>
-          </w:tcPr>
-          <w:p>
-            <w:r>
-              <w:t>Evidence produced</w:t>
-            </w:r>
-          </w:p>
-        </w:tc>
-      </w:tr>
-      <w:tr>
-        <w:tc>
-          <w:tcPr>
-            <w:tcW w:type="dxa" w:w="1728"/>
-          </w:tcPr>
-          <w:p>
-            <w:r>
-              <w:t>9:30am - 10:45am</w:t>
-            </w:r>
-          </w:p>
-        </w:tc>
-        <w:tc>
-          <w:tcPr>
-            <w:tcW w:type="dxa" w:w="1728"/>
-          </w:tcPr>
-          <w:p>
-            <w:r>
-              <w:t>75 min</w:t>
-            </w:r>
-          </w:p>
-        </w:tc>
-        <w:tc>
-          <w:tcPr>
-            <w:tcW w:type="dxa" w:w="1728"/>
-          </w:tcPr>
-          <w:p>
-            <w:r>
-              <w:t>Lab 5.3 - Generate an Avatar News Video with HeyGen</w:t>
-            </w:r>
-          </w:p>
-        </w:tc>
-        <w:tc>
-          <w:tcPr>
-            <w:tcW w:type="dxa" w:w="1728"/>
-          </w:tcPr>
-          <w:p>
-            <w:r>
-              <w:t>Slide 166</w:t>
-            </w:r>
-          </w:p>
-        </w:tc>
-        <w:tc>
-          <w:tcPr>
-            <w:tcW w:type="dxa" w:w="1728"/>
-          </w:tcPr>
-          <w:p>
-            <w:r>
-              <w:t>A generated avatar news video and quality review notes.</w:t>
-            </w:r>
-          </w:p>
-        </w:tc>
-      </w:tr>
-      <w:tr>
-        <w:tc>
-          <w:tcPr>
-            <w:tcW w:type="dxa" w:w="1728"/>
-          </w:tcPr>
-          <w:p>
-            <w:r>
-              <w:t>10:45am - 12:00pm</w:t>
-            </w:r>
-          </w:p>
-        </w:tc>
-        <w:tc>
-          <w:tcPr>
-            <w:tcW w:type="dxa" w:w="1728"/>
-          </w:tcPr>
-          <w:p>
-            <w:r>
-              <w:t>75 min</w:t>
-            </w:r>
-          </w:p>
-        </w:tc>
-        <w:tc>
-          <w:tcPr>
-            <w:tcW w:type="dxa" w:w="1728"/>
-          </w:tcPr>
-          <w:p>
-            <w:r>
-              <w:t>Lab 5.4 - Generate a Cinematic Video with Veo 3.1 and Gemini</w:t>
-            </w:r>
-          </w:p>
-        </w:tc>
-        <w:tc>
-          <w:tcPr>
-            <w:tcW w:type="dxa" w:w="1728"/>
-          </w:tcPr>
-          <w:p>
-            <w:r>
-              <w:t>Slide 172</w:t>
-            </w:r>
-          </w:p>
-        </w:tc>
-        <w:tc>
-          <w:tcPr>
-            <w:tcW w:type="dxa" w:w="1728"/>
-          </w:tcPr>
-          <w:p>
-            <w:r>
-              <w:t>A generated Veo clip, the gemma4 shot script that produced it, and a note on what changed between two prompt versions.</w:t>
-            </w:r>
-          </w:p>
-        </w:tc>
-      </w:tr>
-      <w:tr>
-        <w:tc>
-          <w:tcPr>
-            <w:tcW w:type="dxa" w:w="1728"/>
-          </w:tcPr>
-          <w:p>
-            <w:r>
-              <w:t>12:00pm - 1:30pm</w:t>
-            </w:r>
-          </w:p>
-        </w:tc>
-        <w:tc>
-          <w:tcPr>
-            <w:tcW w:type="dxa" w:w="1728"/>
-          </w:tcPr>
-          <w:p>
-            <w:r>
-              <w:t>90 min</w:t>
-            </w:r>
-          </w:p>
-        </w:tc>
-        <w:tc>
-          <w:tcPr>
-            <w:tcW w:type="dxa" w:w="1728"/>
-          </w:tcPr>
-          <w:p>
-            <w:r>
-              <w:t>Lab 5.5 - Build the Free Local Avatar Video Pipeline</w:t>
-            </w:r>
-          </w:p>
-        </w:tc>
-        <w:tc>
-          <w:tcPr>
-            <w:tcW w:type="dxa" w:w="1728"/>
-          </w:tcPr>
-          <w:p>
-            <w:r>
-              <w:t>Slide 179</w:t>
-            </w:r>
-          </w:p>
-        </w:tc>
-        <w:tc>
-          <w:tcPr>
-            <w:tcW w:type="dxa" w:w="1728"/>
-          </w:tcPr>
-          <w:p>
-            <w:r>
-              <w:t>A free local avatar video and comparison notes.</w:t>
-            </w:r>
-          </w:p>
-        </w:tc>
-      </w:tr>
-      <w:tr>
-        <w:tc>
-          <w:tcPr>
-            <w:tcW w:type="dxa" w:w="1728"/>
-          </w:tcPr>
-          <w:p>
-            <w:r>
-              <w:t>1:30pm - 2:30pm</w:t>
-            </w:r>
-          </w:p>
-        </w:tc>
-        <w:tc>
-          <w:tcPr>
-            <w:tcW w:type="dxa" w:w="1728"/>
-          </w:tcPr>
-          <w:p>
-            <w:r>
-              <w:t>60 min</w:t>
-            </w:r>
-          </w:p>
-        </w:tc>
-        <w:tc>
-          <w:tcPr>
-            <w:tcW w:type="dxa" w:w="1728"/>
-          </w:tcPr>
-          <w:p>
-            <w:r>
-              <w:t>LUNCH</w:t>
-            </w:r>
-          </w:p>
-        </w:tc>
-        <w:tc>
-          <w:tcPr>
-            <w:tcW w:type="dxa" w:w="1728"/>
-          </w:tcPr>
-          <w:p>
-            <w:r>
-              <w:t>-</w:t>
-            </w:r>
-          </w:p>
-        </w:tc>
-        <w:tc>
-          <w:tcPr>
-            <w:tcW w:type="dxa" w:w="1728"/>
-          </w:tcPr>
-          <w:p>
-            <w:r>
-              <w:t>-</w:t>
-            </w:r>
-          </w:p>
-        </w:tc>
-      </w:tr>
-      <w:tr>
-        <w:tc>
-          <w:tcPr>
-            <w:tcW w:type="dxa" w:w="1728"/>
-          </w:tcPr>
-          <w:p>
-            <w:r>
-              <w:t>2:30pm - 3:45pm</w:t>
-            </w:r>
-          </w:p>
-        </w:tc>
-        <w:tc>
-          <w:tcPr>
-            <w:tcW w:type="dxa" w:w="1728"/>
-          </w:tcPr>
-          <w:p>
-            <w:r>
-              <w:t>75 min</w:t>
-            </w:r>
-          </w:p>
-        </w:tc>
-        <w:tc>
-          <w:tcPr>
-            <w:tcW w:type="dxa" w:w="1728"/>
-          </w:tcPr>
-          <w:p>
-            <w:r>
-              <w:t>Lab 6.1 - Publish the Avatar Video to YouTube</w:t>
-            </w:r>
-          </w:p>
-        </w:tc>
-        <w:tc>
-          <w:tcPr>
-            <w:tcW w:type="dxa" w:w="1728"/>
-          </w:tcPr>
-          <w:p>
-            <w:r>
-              <w:t>Slide 185</w:t>
-            </w:r>
-          </w:p>
-        </w:tc>
-        <w:tc>
-          <w:tcPr>
-            <w:tcW w:type="dxa" w:w="1728"/>
-          </w:tcPr>
-          <w:p>
-            <w:r>
-              <w:t>An unlisted YouTube upload test with approved metadata.</w:t>
-            </w:r>
-          </w:p>
-        </w:tc>
-      </w:tr>
-      <w:tr>
-        <w:tc>
-          <w:tcPr>
-            <w:tcW w:type="dxa" w:w="1728"/>
-          </w:tcPr>
-          <w:p>
-            <w:r>
-              <w:t>3:45pm - 5:00pm</w:t>
-            </w:r>
-          </w:p>
-        </w:tc>
-        <w:tc>
-          <w:tcPr>
-            <w:tcW w:type="dxa" w:w="1728"/>
-          </w:tcPr>
-          <w:p>
-            <w:r>
-              <w:t>75 min</w:t>
-            </w:r>
-          </w:p>
-        </w:tc>
-        <w:tc>
-          <w:tcPr>
-            <w:tcW w:type="dxa" w:w="1728"/>
-          </w:tcPr>
-          <w:p>
-            <w:r>
-              <w:t>Lab 6.2 - Build an Interactive Avatar That Renders in the Browser</w:t>
-            </w:r>
-          </w:p>
-        </w:tc>
-        <w:tc>
-          <w:tcPr>
-            <w:tcW w:type="dxa" w:w="1728"/>
-          </w:tcPr>
-          <w:p>
-            <w:r>
-              <w:t>Slide 190</w:t>
-            </w:r>
-          </w:p>
-        </w:tc>
-        <w:tc>
-          <w:tcPr>
-            <w:tcW w:type="dxa" w:w="1728"/>
-          </w:tcPr>
-          <w:p>
-            <w:r>
-              <w:t>A working browser avatar, the measured latency, and a note naming the three settings that produced it.</w:t>
-            </w:r>
-          </w:p>
-        </w:tc>
-      </w:tr>
-      <w:tr>
-        <w:tc>
-          <w:tcPr>
-            <w:tcW w:type="dxa" w:w="1728"/>
-          </w:tcPr>
-          <w:p>
-            <w:r>
-              <w:t>5:00pm - 6:15pm</w:t>
-            </w:r>
-          </w:p>
-        </w:tc>
-        <w:tc>
-          <w:tcPr>
-            <w:tcW w:type="dxa" w:w="1728"/>
-          </w:tcPr>
-          <w:p>
-            <w:r>
-              <w:t>75 min</w:t>
-            </w:r>
-          </w:p>
-        </w:tc>
-        <w:tc>
-          <w:tcPr>
-            <w:tcW w:type="dxa" w:w="1728"/>
-          </w:tcPr>
-          <w:p>
-            <w:r>
-              <w:t>Lab 6.3 - Embed an Interactive HeyGen Avatar with LiveAvatar</w:t>
-            </w:r>
-          </w:p>
-        </w:tc>
-        <w:tc>
-          <w:tcPr>
-            <w:tcW w:type="dxa" w:w="1728"/>
-          </w:tcPr>
-          <w:p>
-            <w:r>
-              <w:t>Slide 197</w:t>
-            </w:r>
-          </w:p>
-        </w:tc>
-        <w:tc>
-          <w:tcPr>
-            <w:tcW w:type="dxa" w:w="1728"/>
-          </w:tcPr>
-          <w:p>
-            <w:r>
-              <w:t>A working streaming avatar session plus the two-column scorecard comparing it against the browser-rendered avatar.</w:t>
-            </w:r>
-          </w:p>
-        </w:tc>
-      </w:tr>
-      <w:tr>
-        <w:tc>
-          <w:tcPr>
-            <w:tcW w:type="dxa" w:w="1728"/>
-          </w:tcPr>
-          <w:p>
-            <w:r>
-              <w:t>6:15pm - 6:30pm</w:t>
-            </w:r>
-          </w:p>
-        </w:tc>
-        <w:tc>
-          <w:tcPr>
-            <w:tcW w:type="dxa" w:w="1728"/>
-          </w:tcPr>
-          <w:p>
-            <w:r>
-              <w:t>15 min</w:t>
-            </w:r>
-          </w:p>
-        </w:tc>
-        <w:tc>
-          <w:tcPr>
-            <w:tcW w:type="dxa" w:w="1728"/>
-          </w:tcPr>
-          <w:p>
-            <w:r>
-              <w:t>Concept delivery, review and evidence check - the trainer teaches the concept, workflow and quality slides for the day's labs, then learners show their executions, transcripts and scorecards</w:t>
-            </w:r>
-          </w:p>
-        </w:tc>
-        <w:tc>
-          <w:tcPr>
-            <w:tcW w:type="dxa" w:w="1728"/>
-          </w:tcPr>
-          <w:p>
-            <w:r>
-              <w:t>-</w:t>
-            </w:r>
-          </w:p>
-        </w:tc>
-        <w:tc>
-          <w:tcPr>
-            <w:tcW w:type="dxa" w:w="1728"/>
-          </w:tcPr>
-          <w:p>
-            <w:r>
-              <w:t>Trainer sign-off on the day's evidence</w:t>
-            </w:r>
-          </w:p>
-        </w:tc>
-      </w:tr>
-    </w:tbl>
-    <w:p/>
-    <w:p>
-      <w:r>
-        <w:t>Day 4 instructional time: 8h 00m (9:30am-6:30pm, less a 1-hour lunch; tea breaks are taken inside the sessions).</w:t>
-      </w:r>
-    </w:p>
-    <w:p/>
-    <w:p>
-      <w:pPr>
-        <w:pStyle w:val="Heading2"/>
-      </w:pPr>
-      <w:r>
-        <w:t>Day 5</w:t>
-      </w:r>
-    </w:p>
-    <w:p/>
-    <w:tbl>
-      <w:tblPr>
-        <w:tblStyle w:val="LightGrid-Accent1"/>
-        <w:tblW w:type="auto" w:w="0"/>
-        <w:tblLook w:firstColumn="1" w:firstRow="1" w:lastColumn="0" w:lastRow="0" w:noHBand="0" w:noVBand="1" w:val="04A0"/>
-      </w:tblPr>
-      <w:tblGrid>
-        <w:gridCol w:w="1728"/>
-        <w:gridCol w:w="1728"/>
-        <w:gridCol w:w="1728"/>
-        <w:gridCol w:w="1728"/>
-        <w:gridCol w:w="1728"/>
-      </w:tblGrid>
-      <w:tr>
-        <w:tc>
-          <w:tcPr>
-            <w:tcW w:type="dxa" w:w="1728"/>
-          </w:tcPr>
-          <w:p>
-            <w:r>
-              <w:t>Time</w:t>
-            </w:r>
-          </w:p>
-        </w:tc>
-        <w:tc>
-          <w:tcPr>
-            <w:tcW w:type="dxa" w:w="1728"/>
-          </w:tcPr>
-          <w:p>
-            <w:r>
-              <w:t>Duration</w:t>
-            </w:r>
-          </w:p>
-        </w:tc>
-        <w:tc>
-          <w:tcPr>
-            <w:tcW w:type="dxa" w:w="1728"/>
-          </w:tcPr>
-          <w:p>
-            <w:r>
-              <w:t>Topic / Activity</w:t>
-            </w:r>
-          </w:p>
-        </w:tc>
-        <w:tc>
-          <w:tcPr>
-            <w:tcW w:type="dxa" w:w="1728"/>
-          </w:tcPr>
-          <w:p>
-            <w:r>
-              <w:t>Deck</w:t>
-            </w:r>
-          </w:p>
-        </w:tc>
-        <w:tc>
-          <w:tcPr>
-            <w:tcW w:type="dxa" w:w="1728"/>
-          </w:tcPr>
-          <w:p>
-            <w:r>
-              <w:t>Evidence produced</w:t>
-            </w:r>
-          </w:p>
-        </w:tc>
-      </w:tr>
-      <w:tr>
-        <w:tc>
-          <w:tcPr>
-            <w:tcW w:type="dxa" w:w="1728"/>
-          </w:tcPr>
-          <w:p>
-            <w:r>
-              <w:t>9:30am - 10:30am</w:t>
-            </w:r>
-          </w:p>
-        </w:tc>
-        <w:tc>
-          <w:tcPr>
-            <w:tcW w:type="dxa" w:w="1728"/>
-          </w:tcPr>
-          <w:p>
-            <w:r>
-              <w:t>60 min</w:t>
-            </w:r>
-          </w:p>
-        </w:tc>
-        <w:tc>
-          <w:tcPr>
-            <w:tcW w:type="dxa" w:w="1728"/>
-          </w:tcPr>
-          <w:p>
-            <w:r>
-              <w:t>Lab 6.4 - Monitor, Debug, and Recover AI Workflows</w:t>
-            </w:r>
-          </w:p>
-        </w:tc>
-        <w:tc>
-          <w:tcPr>
-            <w:tcW w:type="dxa" w:w="1728"/>
-          </w:tcPr>
-          <w:p>
-            <w:r>
-              <w:t>Slide 204</w:t>
-            </w:r>
-          </w:p>
-        </w:tc>
-        <w:tc>
-          <w:tcPr>
-            <w:tcW w:type="dxa" w:w="1728"/>
-          </w:tcPr>
-          <w:p>
-            <w:r>
-              <w:t>A monitoring runbook and one tested error branch.</w:t>
-            </w:r>
-          </w:p>
-        </w:tc>
-      </w:tr>
-      <w:tr>
-        <w:tc>
-          <w:tcPr>
-            <w:tcW w:type="dxa" w:w="1728"/>
-          </w:tcPr>
-          <w:p>
-            <w:r>
-              <w:t>10:30am - 12:30pm</w:t>
-            </w:r>
-          </w:p>
-        </w:tc>
-        <w:tc>
-          <w:tcPr>
-            <w:tcW w:type="dxa" w:w="1728"/>
-          </w:tcPr>
-          <w:p>
-            <w:r>
-              <w:t>120 min</w:t>
-            </w:r>
-          </w:p>
-        </w:tc>
-        <w:tc>
-          <w:tcPr>
-            <w:tcW w:type="dxa" w:w="1728"/>
-          </w:tcPr>
-          <w:p>
-            <w:r>
-              <w:t>Lab 6.5 - Capstone - Build a Human-AI Workforce Automation</w:t>
-            </w:r>
-          </w:p>
-        </w:tc>
-        <w:tc>
-          <w:tcPr>
-            <w:tcW w:type="dxa" w:w="1728"/>
-          </w:tcPr>
-          <w:p>
-            <w:r>
-              <w:t>Slide 209</w:t>
-            </w:r>
-          </w:p>
-        </w:tc>
-        <w:tc>
-          <w:tcPr>
-            <w:tcW w:type="dxa" w:w="1728"/>
-          </w:tcPr>
-          <w:p>
-            <w:r>
-              <w:t>A capstone package suitable for trainer assessment and learner portfolio.</w:t>
-            </w:r>
-          </w:p>
-        </w:tc>
-      </w:tr>
-      <w:tr>
-        <w:tc>
-          <w:tcPr>
-            <w:tcW w:type="dxa" w:w="1728"/>
-          </w:tcPr>
-          <w:p>
-            <w:r>
-              <w:t>12:30pm - 1:30pm</w:t>
-            </w:r>
-          </w:p>
-        </w:tc>
-        <w:tc>
-          <w:tcPr>
-            <w:tcW w:type="dxa" w:w="1728"/>
-          </w:tcPr>
-          <w:p>
-            <w:r>
-              <w:t>60 min</w:t>
-            </w:r>
-          </w:p>
-        </w:tc>
-        <w:tc>
-          <w:tcPr>
-            <w:tcW w:type="dxa" w:w="1728"/>
-          </w:tcPr>
-          <w:p>
-            <w:r>
-              <w:t>LUNCH</w:t>
-            </w:r>
-          </w:p>
-        </w:tc>
-        <w:tc>
-          <w:tcPr>
-            <w:tcW w:type="dxa" w:w="1728"/>
-          </w:tcPr>
-          <w:p>
-            <w:r>
-              <w:t>-</w:t>
-            </w:r>
-          </w:p>
-        </w:tc>
-        <w:tc>
-          <w:tcPr>
-            <w:tcW w:type="dxa" w:w="1728"/>
-          </w:tcPr>
-          <w:p>
-            <w:r>
-              <w:t>-</w:t>
-            </w:r>
-          </w:p>
-        </w:tc>
-      </w:tr>
-      <w:tr>
-        <w:tc>
-          <w:tcPr>
-            <w:tcW w:type="dxa" w:w="1728"/>
-          </w:tcPr>
-          <w:p>
-            <w:r>
-              <w:t>1:30pm - 4:15pm</w:t>
-            </w:r>
-          </w:p>
-        </w:tc>
-        <w:tc>
-          <w:tcPr>
-            <w:tcW w:type="dxa" w:w="1728"/>
-          </w:tcPr>
-          <w:p>
-            <w:r>
-              <w:t>165 min</w:t>
+              <w:t>45 min</w:t>
             </w:r>
           </w:p>
         </w:tc>
@@ -3842,7 +2347,7 @@
     <w:p/>
     <w:p>
       <w:r>
-        <w:t>Day 5 instructional time: 8h 00m (9:30am-6:30pm, less a 1-hour lunch; tea breaks are taken inside the sessions).</w:t>
+        <w:t>Day 2 instructional time: 8h 00m (9:30am-6:30pm, less a 1-hour lunch; tea breaks are taken inside the sessions).</w:t>
       </w:r>
     </w:p>
     <w:p/>
@@ -4066,7 +2571,7 @@
         <w:pStyle w:val="ListBullet"/>
       </w:pPr>
       <w:r>
-        <w:t>The RAG evaluation sheet (Lab 2.4) with two chunking configurations scored.</w:t>
+        <w:t>The provoked failures: the RAG refusal (Lab 2), the course that does not exist (Lab 3), Ava's medical refusals (Lab 5).</w:t>
       </w:r>
     </w:p>
     <w:p>
@@ -4074,7 +2579,7 @@
         <w:pStyle w:val="ListBullet"/>
       </w:pPr>
       <w:r>
-        <w:t>Voice call transcripts and the QA scorecard (Lab 4.3).</w:t>
+        <w:t>The Google Calendar booking created by voice, with its call transcript (Lab 4).</w:t>
       </w:r>
     </w:p>
     <w:p>
@@ -4082,7 +2587,7 @@
         <w:pStyle w:val="ListBullet"/>
       </w:pPr>
       <w:r>
-        <w:t>The lip-sync comparison scorecard: Wav2Lip vs MuseTalk vs HeyGen on one script (Lab 5.1).</w:t>
+        <w:t>The lip-sync comparison scorecard: MuseTalk vs HeyGen on one script (Lab 6).</w:t>
       </w:r>
     </w:p>
     <w:p>
@@ -4090,15 +2595,7 @@
         <w:pStyle w:val="ListBullet"/>
       </w:pPr>
       <w:r>
-        <w:t>Generated media: the avatar news video, the Veo clip, the interactive avatar session.</w:t>
-      </w:r>
-    </w:p>
-    <w:p>
-      <w:pPr>
-        <w:pStyle w:val="ListBullet"/>
-      </w:pPr>
-      <w:r>
-        <w:t>The capstone workflow export and its one-page operating guide.</w:t>
+        <w:t>Generated media: the news avatar videos (Labs 7 and 7-os), the Aria latency screenshot (Lab 8), the Nova session scorecard (Lab 9), the Veo clip and its shot prompt (Lab 10).</w:t>
       </w:r>
     </w:p>
     <w:sectPr>

</xml_diff>

<commit_message>
feat(labs): lab8 on AI Agent in both trees with richer Aria prompt; lab7 takes the full webhook URL
- Lab 8 (local + remote): rebuilt on AI Agent + chat-model sub-node (Ollama
  gemma4 locally, gpt-4.1-mini remotely) - one credential to attach, easier
  for learners to configure. Richer Aria system prompt (always answer, never
  blame the caller's mic), think-block stripping, graceful fallbacks and a
  trainer-facing debug field. Deck + Learner Guides updated to match.
- Lab 7 (both trees): the settings box now takes the FULL Production URL of
  the heygen-generate webhook (status URL derived from it); input widened
  and enlarged for pasting long URLs; new storage key so stale base values
  are ignored.

Co-Authored-By: Claude Fable 5 <noreply@anthropic.com>
</commit_message>
<xml_diff>
--- a/courseware/LP-Automate-Video-and-Voice-AI-Agents-with-n8n.docx
+++ b/courseware/LP-Automate-Video-and-Voice-AI-Agents-with-n8n.docx
@@ -721,7 +721,7 @@
         </w:rPr>
         <w:t>Evidence the trainer collects</w:t>
         <w:tab/>
-        <w:t>9</w:t>
+        <w:t>10</w:t>
       </w:r>
     </w:p>
     <w:p>
@@ -1974,7 +1974,7 @@
           </w:tcPr>
           <w:p>
             <w:r>
-              <w:t>A conversation with Aria plus the latency-panel screenshot proving ~2 s replies.</w:t>
+              <w:t>A conversation with Aria, the latency-panel screenshot, and one prompt improvement you made and re-tested.</w:t>
             </w:r>
           </w:p>
         </w:tc>

</xml_diff>

<commit_message>
feat(courseware): drop Practice Exam slide; Labs 7 & 10 become create-your-own-and-share activities
- No practice exam exists for this course - closing block is now
  Briefing -> Assessment -> Assessment Flow -> TRAQOM -> Thank You.
- Lab 7: learners write their OWN news item and play the broadcast to
  the class; Lab 10: learners generate a clip from their own idea and
  present it, with the before/after prompt note. Deck + LG updated.

Co-Authored-By: Claude Fable 5 <noreply@anthropic.com>
</commit_message>
<xml_diff>
--- a/courseware/LP-Automate-Video-and-Voice-AI-Agents-with-n8n.docx
+++ b/courseware/LP-Automate-Video-and-Voice-AI-Agents-with-n8n.docx
@@ -1870,7 +1870,7 @@
           </w:tcPr>
           <w:p>
             <w:r>
-              <w:t>A generated avatar news video plus quality-review notes on the script and the render.</w:t>
+              <w:t>Your own news broadcast, played to the class, plus quality-review notes on the script and the render.</w:t>
             </w:r>
           </w:p>
         </w:tc>
@@ -2130,7 +2130,7 @@
           </w:tcPr>
           <w:p>
             <w:r>
-              <w:t>A rendered Veo clip, the shot prompt that produced it, and a note on what changed between two prompt versions.</w:t>
+              <w:t>Your own Veo clip presented to the class, the shot prompt that produced it, and a note on what changed between two prompt versions.</w:t>
             </w:r>
           </w:p>
         </w:tc>

</xml_diff>